<commit_message>
v1.0.1 user password reset, admin password reset, optional tls support for lab or small deployments
</commit_message>
<xml_diff>
--- a/FERALCTF_SPEC.docx
+++ b/FERALCTF_SPEC.docx
@@ -2,7 +2,7 @@
 <file path=word/document.xml><?xml version="1.0" encoding="utf-8"?>
 <w:document xmlns:w="http://schemas.openxmlformats.org/wordprocessingml/2006/main" xmlns:m="http://schemas.openxmlformats.org/officeDocument/2006/math" xmlns:r="http://schemas.openxmlformats.org/officeDocument/2006/relationships" xmlns:o="urn:schemas-microsoft-com:office:office" xmlns:v="urn:schemas-microsoft-com:vml" xmlns:w10="urn:schemas-microsoft-com:office:word" xmlns:a="http://schemas.openxmlformats.org/drawingml/2006/main" xmlns:pic="http://schemas.openxmlformats.org/drawingml/2006/picture" xmlns:wp="http://schemas.openxmlformats.org/drawingml/2006/wordprocessingDrawing">
   <w:body>
-    <w:bookmarkStart w:id="78" w:name="feralctf-technical-specification-v1.0"/>
+    <w:bookmarkStart w:id="79" w:name="feralctf-technical-specification-v1.0"/>
     <w:p>
       <w:pPr>
         <w:pStyle w:val="Heading1"/>
@@ -1826,7 +1826,7 @@
               <w:jc w:val="left"/>
             </w:pPr>
             <w:r>
-              <w:t xml:space="preserve">Reverse proxy (nginx/Caddy) — not built-in</w:t>
+              <w:t xml:space="preserve">Reverse proxy recommended (nginx/Caddy); built-in Rustls optional</w:t>
             </w:r>
           </w:p>
         </w:tc>
@@ -7469,7 +7469,7 @@
               <w:jc w:val="left"/>
             </w:pPr>
             <w:r>
-              <w:t xml:space="preserve">Change password</w:t>
+              <w:t xml:space="preserve">Change password and revoke all sessions for the user</w:t>
             </w:r>
           </w:p>
         </w:tc>
@@ -10695,6 +10695,59 @@
               <w:jc w:val="left"/>
             </w:pPr>
             <w:r>
+              <w:t xml:space="preserve">PUT</w:t>
+            </w:r>
+          </w:p>
+        </w:tc>
+        <w:tc>
+          <w:tcPr/>
+          <w:p>
+            <w:pPr>
+              <w:pStyle w:val="Compact"/>
+              <w:jc w:val="left"/>
+            </w:pPr>
+            <w:r>
+              <w:rPr>
+                <w:rStyle w:val="VerbatimChar"/>
+              </w:rPr>
+              <w:t xml:space="preserve">/api/admin/users/:id/password</w:t>
+            </w:r>
+          </w:p>
+        </w:tc>
+        <w:tc>
+          <w:tcPr/>
+          <w:p>
+            <w:pPr>
+              <w:pStyle w:val="Compact"/>
+              <w:jc w:val="left"/>
+            </w:pPr>
+            <w:r>
+              <w:t xml:space="preserve">Admin</w:t>
+            </w:r>
+          </w:p>
+        </w:tc>
+        <w:tc>
+          <w:tcPr/>
+          <w:p>
+            <w:pPr>
+              <w:pStyle w:val="Compact"/>
+              <w:jc w:val="left"/>
+            </w:pPr>
+            <w:r>
+              <w:t xml:space="preserve">Assign a new password and revoke all target-user sessions</w:t>
+            </w:r>
+          </w:p>
+        </w:tc>
+      </w:tr>
+      <w:tr>
+        <w:tc>
+          <w:tcPr/>
+          <w:p>
+            <w:pPr>
+              <w:pStyle w:val="Compact"/>
+              <w:jc w:val="left"/>
+            </w:pPr>
+            <w:r>
               <w:t xml:space="preserve">POST</w:t>
             </w:r>
           </w:p>
@@ -15759,6 +15812,186 @@
         <w:br/>
       </w:r>
       <w:r>
+        <w:rPr>
+          <w:rStyle w:val="DataTypeTok"/>
+        </w:rPr>
+        <w:t xml:space="preserve">tls_enabled</w:t>
+      </w:r>
+      <w:r>
+        <w:rPr>
+          <w:rStyle w:val="NormalTok"/>
+        </w:rPr>
+        <w:t xml:space="preserve"> </w:t>
+      </w:r>
+      <w:r>
+        <w:rPr>
+          <w:rStyle w:val="OperatorTok"/>
+        </w:rPr>
+        <w:t xml:space="preserve">=</w:t>
+      </w:r>
+      <w:r>
+        <w:rPr>
+          <w:rStyle w:val="NormalTok"/>
+        </w:rPr>
+        <w:t xml:space="preserve"> </w:t>
+      </w:r>
+      <w:r>
+        <w:rPr>
+          <w:rStyle w:val="ConstantTok"/>
+        </w:rPr>
+        <w:t xml:space="preserve">false</w:t>
+      </w:r>
+      <w:r>
+        <w:rPr>
+          <w:rStyle w:val="NormalTok"/>
+        </w:rPr>
+        <w:t xml:space="preserve">                          </w:t>
+      </w:r>
+      <w:r>
+        <w:rPr>
+          <w:rStyle w:val="CommentTok"/>
+        </w:rPr>
+        <w:t xml:space="preserve"># optional direct HTTPS; reverse proxy recommended for production</w:t>
+      </w:r>
+      <w:r>
+        <w:br/>
+      </w:r>
+      <w:r>
+        <w:rPr>
+          <w:rStyle w:val="DataTypeTok"/>
+        </w:rPr>
+        <w:t xml:space="preserve">tls_cert_path</w:t>
+      </w:r>
+      <w:r>
+        <w:rPr>
+          <w:rStyle w:val="NormalTok"/>
+        </w:rPr>
+        <w:t xml:space="preserve"> </w:t>
+      </w:r>
+      <w:r>
+        <w:rPr>
+          <w:rStyle w:val="OperatorTok"/>
+        </w:rPr>
+        <w:t xml:space="preserve">=</w:t>
+      </w:r>
+      <w:r>
+        <w:rPr>
+          <w:rStyle w:val="NormalTok"/>
+        </w:rPr>
+        <w:t xml:space="preserve"> </w:t>
+      </w:r>
+      <w:r>
+        <w:rPr>
+          <w:rStyle w:val="StringTok"/>
+        </w:rPr>
+        <w:t xml:space="preserve">""</w:t>
+      </w:r>
+      <w:r>
+        <w:rPr>
+          <w:rStyle w:val="NormalTok"/>
+        </w:rPr>
+        <w:t xml:space="preserve">                           </w:t>
+      </w:r>
+      <w:r>
+        <w:rPr>
+          <w:rStyle w:val="CommentTok"/>
+        </w:rPr>
+        <w:t xml:space="preserve"># PEM leaf certificate</w:t>
+      </w:r>
+      <w:r>
+        <w:br/>
+      </w:r>
+      <w:r>
+        <w:rPr>
+          <w:rStyle w:val="DataTypeTok"/>
+        </w:rPr>
+        <w:t xml:space="preserve">tls_key_path</w:t>
+      </w:r>
+      <w:r>
+        <w:rPr>
+          <w:rStyle w:val="NormalTok"/>
+        </w:rPr>
+        <w:t xml:space="preserve"> </w:t>
+      </w:r>
+      <w:r>
+        <w:rPr>
+          <w:rStyle w:val="OperatorTok"/>
+        </w:rPr>
+        <w:t xml:space="preserve">=</w:t>
+      </w:r>
+      <w:r>
+        <w:rPr>
+          <w:rStyle w:val="NormalTok"/>
+        </w:rPr>
+        <w:t xml:space="preserve"> </w:t>
+      </w:r>
+      <w:r>
+        <w:rPr>
+          <w:rStyle w:val="StringTok"/>
+        </w:rPr>
+        <w:t xml:space="preserve">""</w:t>
+      </w:r>
+      <w:r>
+        <w:rPr>
+          <w:rStyle w:val="NormalTok"/>
+        </w:rPr>
+        <w:t xml:space="preserve">                            </w:t>
+      </w:r>
+      <w:r>
+        <w:rPr>
+          <w:rStyle w:val="CommentTok"/>
+        </w:rPr>
+        <w:t xml:space="preserve"># PEM private key</w:t>
+      </w:r>
+      <w:r>
+        <w:br/>
+      </w:r>
+      <w:r>
+        <w:rPr>
+          <w:rStyle w:val="DataTypeTok"/>
+        </w:rPr>
+        <w:t xml:space="preserve">tls_chain_path</w:t>
+      </w:r>
+      <w:r>
+        <w:rPr>
+          <w:rStyle w:val="NormalTok"/>
+        </w:rPr>
+        <w:t xml:space="preserve"> </w:t>
+      </w:r>
+      <w:r>
+        <w:rPr>
+          <w:rStyle w:val="OperatorTok"/>
+        </w:rPr>
+        <w:t xml:space="preserve">=</w:t>
+      </w:r>
+      <w:r>
+        <w:rPr>
+          <w:rStyle w:val="NormalTok"/>
+        </w:rPr>
+        <w:t xml:space="preserve"> </w:t>
+      </w:r>
+      <w:r>
+        <w:rPr>
+          <w:rStyle w:val="StringTok"/>
+        </w:rPr>
+        <w:t xml:space="preserve">""</w:t>
+      </w:r>
+      <w:r>
+        <w:rPr>
+          <w:rStyle w:val="NormalTok"/>
+        </w:rPr>
+        <w:t xml:space="preserve">                          </w:t>
+      </w:r>
+      <w:r>
+        <w:rPr>
+          <w:rStyle w:val="CommentTok"/>
+        </w:rPr>
+        <w:t xml:space="preserve"># optional PEM intermediate chain</w:t>
+      </w:r>
+      <w:r>
+        <w:br/>
+      </w:r>
+      <w:r>
         <w:br/>
       </w:r>
       <w:r>
@@ -16736,6 +16969,90 @@
           <w:rStyle w:val="NormalTok"/>
         </w:rPr>
         <w:t xml:space="preserve">https://ctf.yourdomain.com</w:t>
+      </w:r>
+      <w:r>
+        <w:br/>
+      </w:r>
+      <w:r>
+        <w:rPr>
+          <w:rStyle w:val="VariableTok"/>
+        </w:rPr>
+        <w:t xml:space="preserve">FERALCTF_SERVER_TLS_ENABLED</w:t>
+      </w:r>
+      <w:r>
+        <w:rPr>
+          <w:rStyle w:val="OperatorTok"/>
+        </w:rPr>
+        <w:t xml:space="preserve">=</w:t>
+      </w:r>
+      <w:r>
+        <w:rPr>
+          <w:rStyle w:val="NormalTok"/>
+        </w:rPr>
+        <w:t xml:space="preserve">true</w:t>
+      </w:r>
+      <w:r>
+        <w:br/>
+      </w:r>
+      <w:r>
+        <w:rPr>
+          <w:rStyle w:val="VariableTok"/>
+        </w:rPr>
+        <w:t xml:space="preserve">FERALCTF_SERVER_TLS_CERT_PATH</w:t>
+      </w:r>
+      <w:r>
+        <w:rPr>
+          <w:rStyle w:val="OperatorTok"/>
+        </w:rPr>
+        <w:t xml:space="preserve">=</w:t>
+      </w:r>
+      <w:r>
+        <w:rPr>
+          <w:rStyle w:val="NormalTok"/>
+        </w:rPr>
+        <w:t xml:space="preserve">/etc/letsencrypt/live/ctf/fullchain.pem</w:t>
+      </w:r>
+      <w:r>
+        <w:br/>
+      </w:r>
+      <w:r>
+        <w:rPr>
+          <w:rStyle w:val="VariableTok"/>
+        </w:rPr>
+        <w:t xml:space="preserve">FERALCTF_SERVER_TLS_KEY_PATH</w:t>
+      </w:r>
+      <w:r>
+        <w:rPr>
+          <w:rStyle w:val="OperatorTok"/>
+        </w:rPr>
+        <w:t xml:space="preserve">=</w:t>
+      </w:r>
+      <w:r>
+        <w:rPr>
+          <w:rStyle w:val="NormalTok"/>
+        </w:rPr>
+        <w:t xml:space="preserve">/etc/letsencrypt/live/ctf/privkey.pem</w:t>
+      </w:r>
+      <w:r>
+        <w:br/>
+      </w:r>
+      <w:r>
+        <w:rPr>
+          <w:rStyle w:val="VariableTok"/>
+        </w:rPr>
+        <w:t xml:space="preserve">FERALCTF_SERVER_TLS_CHAIN_PATH</w:t>
+      </w:r>
+      <w:r>
+        <w:rPr>
+          <w:rStyle w:val="OperatorTok"/>
+        </w:rPr>
+        <w:t xml:space="preserve">=</w:t>
+      </w:r>
+      <w:r>
+        <w:rPr>
+          <w:rStyle w:val="NormalTok"/>
+        </w:rPr>
+        <w:t xml:space="preserve">/etc/letsencrypt/live/ctf/chain.pem</w:t>
       </w:r>
       <w:r>
         <w:br/>
@@ -16788,7 +17105,7 @@
       </w:r>
     </w:p>
     <w:bookmarkEnd w:id="58"/>
-    <w:bookmarkStart w:id="63" w:name="deployment"/>
+    <w:bookmarkStart w:id="64" w:name="deployment"/>
     <w:p>
       <w:pPr>
         <w:pStyle w:val="Heading2"/>
@@ -16974,13 +17291,13 @@
       </w:r>
     </w:p>
     <w:bookmarkEnd w:id="59"/>
-    <w:bookmarkStart w:id="60" w:name="reverse-proxy-nginx"/>
+    <w:bookmarkStart w:id="60" w:name="https"/>
     <w:p>
       <w:pPr>
         <w:pStyle w:val="Heading3"/>
       </w:pPr>
       <w:r>
-        <w:t xml:space="preserve">8.2 Reverse Proxy (nginx)</w:t>
+        <w:t xml:space="preserve">8.2 HTTPS</w:t>
       </w:r>
     </w:p>
     <w:p>
@@ -16988,7 +17305,111 @@
         <w:pStyle w:val="FirstParagraph"/>
       </w:pPr>
       <w:r>
-        <w:t xml:space="preserve">TLS is handled by the reverse proxy. FeralCTF handles WebSocket upgrade internally.</w:t>
+        <w:t xml:space="preserve">For production deployments, prefer terminating TLS with a reverse proxy such as nginx or Caddy.</w:t>
+      </w:r>
+      <w:r>
+        <w:t xml:space="preserve"> </w:t>
+      </w:r>
+      <w:r>
+        <w:t xml:space="preserve">That keeps certificate renewal, redirects, compression, caching, request limits, and any</w:t>
+      </w:r>
+      <w:r>
+        <w:t xml:space="preserve"> </w:t>
+      </w:r>
+      <w:r>
+        <w:t xml:space="preserve">site-adjacent static files in infrastructure designed for web hosting. FeralCTF handles WebSocket</w:t>
+      </w:r>
+      <w:r>
+        <w:t xml:space="preserve"> </w:t>
+      </w:r>
+      <w:r>
+        <w:t xml:space="preserve">upgrade internally behind the proxy.</w:t>
+      </w:r>
+    </w:p>
+    <w:p>
+      <w:pPr>
+        <w:pStyle w:val="BodyText"/>
+      </w:pPr>
+      <w:r>
+        <w:t xml:space="preserve">FeralCTF also supports direct HTTPS as a simple deployment option when</w:t>
+      </w:r>
+      <w:r>
+        <w:t xml:space="preserve"> </w:t>
+      </w:r>
+      <w:r>
+        <w:rPr>
+          <w:rStyle w:val="VerbatimChar"/>
+        </w:rPr>
+        <w:t xml:space="preserve">server.tls_enabled = true</w:t>
+      </w:r>
+      <w:r>
+        <w:t xml:space="preserve">.</w:t>
+      </w:r>
+      <w:r>
+        <w:t xml:space="preserve"> </w:t>
+      </w:r>
+      <w:r>
+        <w:t xml:space="preserve">Provide a PEM certificate, PEM private key, and optionally a PEM intermediate chain through</w:t>
+      </w:r>
+      <w:r>
+        <w:t xml:space="preserve"> </w:t>
+      </w:r>
+      <w:r>
+        <w:rPr>
+          <w:rStyle w:val="VerbatimChar"/>
+        </w:rPr>
+        <w:t xml:space="preserve">server.tls_cert_path</w:t>
+      </w:r>
+      <w:r>
+        <w:t xml:space="preserve">,</w:t>
+      </w:r>
+      <w:r>
+        <w:t xml:space="preserve"> </w:t>
+      </w:r>
+      <w:r>
+        <w:rPr>
+          <w:rStyle w:val="VerbatimChar"/>
+        </w:rPr>
+        <w:t xml:space="preserve">server.tls_key_path</w:t>
+      </w:r>
+      <w:r>
+        <w:t xml:space="preserve">, and</w:t>
+      </w:r>
+      <w:r>
+        <w:t xml:space="preserve"> </w:t>
+      </w:r>
+      <w:r>
+        <w:rPr>
+          <w:rStyle w:val="VerbatimChar"/>
+        </w:rPr>
+        <w:t xml:space="preserve">server.tls_chain_path</w:t>
+      </w:r>
+      <w:r>
+        <w:t xml:space="preserve">. Startup fails if TLS is</w:t>
+      </w:r>
+      <w:r>
+        <w:t xml:space="preserve"> </w:t>
+      </w:r>
+      <w:r>
+        <w:t xml:space="preserve">enabled and the certificate or key path is missing or cannot be parsed.</w:t>
+      </w:r>
+    </w:p>
+    <w:bookmarkEnd w:id="60"/>
+    <w:bookmarkStart w:id="61" w:name="reverse-proxy-nginx"/>
+    <w:p>
+      <w:pPr>
+        <w:pStyle w:val="Heading3"/>
+      </w:pPr>
+      <w:r>
+        <w:t xml:space="preserve">8.3 Reverse Proxy (nginx)</w:t>
+      </w:r>
+    </w:p>
+    <w:p>
+      <w:pPr>
+        <w:pStyle w:val="FirstParagraph"/>
+      </w:pPr>
+      <w:r>
+        <w:t xml:space="preserve">Recommended production reverse-proxy shape:</w:t>
       </w:r>
     </w:p>
     <w:p>
@@ -17104,8 +17525,8 @@
         <w:t xml:space="preserve">}</w:t>
       </w:r>
     </w:p>
-    <w:bookmarkEnd w:id="60"/>
-    <w:bookmarkStart w:id="61" w:name="systemd-service"/>
+    <w:bookmarkEnd w:id="61"/>
+    <w:bookmarkStart w:id="62" w:name="systemd-service"/>
     <w:p>
       <w:pPr>
         <w:pStyle w:val="Heading3"/>
@@ -17359,8 +17780,8 @@
         <w:t xml:space="preserve">multi-user.target</w:t>
       </w:r>
     </w:p>
-    <w:bookmarkEnd w:id="61"/>
-    <w:bookmarkStart w:id="62" w:name="backup"/>
+    <w:bookmarkEnd w:id="62"/>
+    <w:bookmarkStart w:id="63" w:name="backup"/>
     <w:p>
       <w:pPr>
         <w:pStyle w:val="Heading3"/>
@@ -17528,9 +17949,9 @@
         </w:pict>
       </w:r>
     </w:p>
-    <w:bookmarkEnd w:id="62"/>
     <w:bookmarkEnd w:id="63"/>
-    <w:bookmarkStart w:id="68" w:name="build"/>
+    <w:bookmarkEnd w:id="64"/>
+    <w:bookmarkStart w:id="69" w:name="build"/>
     <w:p>
       <w:pPr>
         <w:pStyle w:val="Heading2"/>
@@ -17539,7 +17960,7 @@
         <w:t xml:space="preserve">9. Build</w:t>
       </w:r>
     </w:p>
-    <w:bookmarkStart w:id="64" w:name="prerequisites"/>
+    <w:bookmarkStart w:id="65" w:name="prerequisites"/>
     <w:p>
       <w:pPr>
         <w:pStyle w:val="Heading3"/>
@@ -17608,8 +18029,8 @@
         <w:t xml:space="preserve">for dev hot-reload</w:t>
       </w:r>
     </w:p>
-    <w:bookmarkEnd w:id="64"/>
-    <w:bookmarkStart w:id="66" w:name="commands"/>
+    <w:bookmarkEnd w:id="65"/>
+    <w:bookmarkStart w:id="67" w:name="commands"/>
     <w:p>
       <w:pPr>
         <w:pStyle w:val="Heading3"/>
@@ -17818,7 +18239,7 @@
         <w:t xml:space="preserve"># lint all targets</w:t>
       </w:r>
     </w:p>
-    <w:bookmarkStart w:id="65" w:name="optional-fully-static-binary-via-musl"/>
+    <w:bookmarkStart w:id="66" w:name="optional-fully-static-binary-via-musl"/>
     <w:p>
       <w:pPr>
         <w:pStyle w:val="Heading4"/>
@@ -17962,9 +18383,9 @@
         <w:t xml:space="preserve">shared-library dependencies.</w:t>
       </w:r>
     </w:p>
-    <w:bookmarkEnd w:id="65"/>
     <w:bookmarkEnd w:id="66"/>
-    <w:bookmarkStart w:id="67" w:name="project-structure"/>
+    <w:bookmarkEnd w:id="67"/>
+    <w:bookmarkStart w:id="68" w:name="project-structure"/>
     <w:p>
       <w:pPr>
         <w:pStyle w:val="Heading3"/>
@@ -18279,9 +18700,9 @@
         </w:pict>
       </w:r>
     </w:p>
-    <w:bookmarkEnd w:id="67"/>
     <w:bookmarkEnd w:id="68"/>
-    <w:bookmarkStart w:id="75" w:name="implementation-status"/>
+    <w:bookmarkEnd w:id="69"/>
+    <w:bookmarkStart w:id="76" w:name="implementation-status"/>
     <w:p>
       <w:pPr>
         <w:pStyle w:val="Heading2"/>
@@ -18323,10 +18744,10 @@
         <w:t xml:space="preserve"> </w:t>
       </w:r>
       <w:r>
-        <w:t xml:space="preserve">(50 tests passing).</w:t>
-      </w:r>
-    </w:p>
-    <w:bookmarkStart w:id="69" w:name="core"/>
+        <w:t xml:space="preserve">(72 tests passing).</w:t>
+      </w:r>
+    </w:p>
+    <w:bookmarkStart w:id="70" w:name="core"/>
     <w:p>
       <w:pPr>
         <w:pStyle w:val="Heading3"/>
@@ -18578,8 +18999,8 @@
         <w:t xml:space="preserve">frontend bundle</w:t>
       </w:r>
     </w:p>
-    <w:bookmarkEnd w:id="69"/>
-    <w:bookmarkStart w:id="70" w:name="ui-ux"/>
+    <w:bookmarkEnd w:id="70"/>
+    <w:bookmarkStart w:id="71" w:name="ui-ux"/>
     <w:p>
       <w:pPr>
         <w:pStyle w:val="Heading3"/>
@@ -18609,7 +19030,7 @@
         </w:numPr>
       </w:pPr>
       <w:r>
-        <w:t xml:space="preserve">☒ Admin navigation shown only to admin-role accounts</w:t>
+        <w:t xml:space="preserve">☒ Profile password change form with confirmation and session revocation</w:t>
       </w:r>
     </w:p>
     <w:p>
@@ -18621,7 +19042,7 @@
         </w:numPr>
       </w:pPr>
       <w:r>
-        <w:t xml:space="preserve">☒ Themed error page for unknown routes (404 and other HTTP error codes)</w:t>
+        <w:t xml:space="preserve">☒ Admin navigation shown only to admin-role accounts</w:t>
       </w:r>
     </w:p>
     <w:p>
@@ -18633,7 +19054,7 @@
         </w:numPr>
       </w:pPr>
       <w:r>
-        <w:t xml:space="preserve">☒ Challenge cards — category color, difficulty dot, solve count, solved marker</w:t>
+        <w:t xml:space="preserve">☒ Themed error page for unknown routes (404 and other HTTP error codes)</w:t>
       </w:r>
     </w:p>
     <w:p>
@@ -18645,7 +19066,7 @@
         </w:numPr>
       </w:pPr>
       <w:r>
-        <w:t xml:space="preserve">☒ Category filter pills and title search on challenge grid</w:t>
+        <w:t xml:space="preserve">☒ Challenge cards — category color, difficulty dot, solve count, solved marker</w:t>
       </w:r>
     </w:p>
     <w:p>
@@ -18657,7 +19078,7 @@
         </w:numPr>
       </w:pPr>
       <w:r>
-        <w:t xml:space="preserve">☒ Challenge visibility toggle (slider) in admin panel — player view syncs immediately</w:t>
+        <w:t xml:space="preserve">☒ Category filter pills and title search on challenge grid</w:t>
       </w:r>
     </w:p>
     <w:p>
@@ -18669,7 +19090,7 @@
         </w:numPr>
       </w:pPr>
       <w:r>
-        <w:t xml:space="preserve">☒ Challenge edit modal in admin panel (title, category, points, description, flag, visibility)</w:t>
+        <w:t xml:space="preserve">☒ Challenge visibility toggle (slider) in admin panel — player view syncs immediately</w:t>
       </w:r>
     </w:p>
     <w:p>
@@ -18681,7 +19102,7 @@
         </w:numPr>
       </w:pPr>
       <w:r>
-        <w:t xml:space="preserve">☒ New challenges default to hidden; visibility opt-in at creation via toggle</w:t>
+        <w:t xml:space="preserve">☒ Challenge edit modal in admin panel (title, category, points, description, flag, visibility)</w:t>
       </w:r>
     </w:p>
     <w:p>
@@ -18693,7 +19114,7 @@
         </w:numPr>
       </w:pPr>
       <w:r>
-        <w:t xml:space="preserve">☒ New challenges default to case-insensitive flag matching</w:t>
+        <w:t xml:space="preserve">☒ New challenges default to hidden; visibility opt-in at creation via toggle</w:t>
       </w:r>
     </w:p>
     <w:p>
@@ -18705,7 +19126,7 @@
         </w:numPr>
       </w:pPr>
       <w:r>
-        <w:t xml:space="preserve">☒ Challenge description renders URLs as clickable hyperlinks (open in new tab)</w:t>
+        <w:t xml:space="preserve">☒ New challenges default to case-insensitive flag matching</w:t>
       </w:r>
     </w:p>
     <w:p>
@@ -18717,7 +19138,7 @@
         </w:numPr>
       </w:pPr>
       <w:r>
-        <w:t xml:space="preserve">☒ Frontend layout aligned with specification mockups (§12)</w:t>
+        <w:t xml:space="preserve">☒ Challenge description renders URLs as clickable hyperlinks (open in new tab)</w:t>
       </w:r>
     </w:p>
     <w:p>
@@ -18729,11 +19150,23 @@
         </w:numPr>
       </w:pPr>
       <w:r>
+        <w:t xml:space="preserve">☒ Frontend layout aligned with specification mockups (§12)</w:t>
+      </w:r>
+    </w:p>
+    <w:p>
+      <w:pPr>
+        <w:pStyle w:val="Compact"/>
+        <w:numPr>
+          <w:ilvl w:val="0"/>
+          <w:numId w:val="1014"/>
+        </w:numPr>
+      </w:pPr>
+      <w:r>
         <w:t xml:space="preserve">☒ Brand icon in header</w:t>
       </w:r>
     </w:p>
-    <w:bookmarkEnd w:id="70"/>
-    <w:bookmarkStart w:id="71" w:name="import-export-1"/>
+    <w:bookmarkEnd w:id="71"/>
+    <w:bookmarkStart w:id="72" w:name="import-export-1"/>
     <w:p>
       <w:pPr>
         <w:pStyle w:val="Heading3"/>
@@ -18835,8 +19268,8 @@
         <w:t xml:space="preserve">)</w:t>
       </w:r>
     </w:p>
-    <w:bookmarkEnd w:id="71"/>
-    <w:bookmarkStart w:id="72" w:name="admin"/>
+    <w:bookmarkEnd w:id="72"/>
+    <w:bookmarkStart w:id="73" w:name="admin"/>
     <w:p>
       <w:pPr>
         <w:pStyle w:val="Heading3"/>
@@ -18923,7 +19356,7 @@
         </w:numPr>
       </w:pPr>
       <w:r>
-        <w:t xml:space="preserve">☒ Team disqualify</w:t>
+        <w:t xml:space="preserve">☒ Admin password assignment with target-user session revocation</w:t>
       </w:r>
     </w:p>
     <w:p>
@@ -18935,7 +19368,7 @@
         </w:numPr>
       </w:pPr>
       <w:r>
-        <w:t xml:space="preserve">☒ Challenge flag update through challenge update</w:t>
+        <w:t xml:space="preserve">☒ Team disqualify</w:t>
       </w:r>
     </w:p>
     <w:p>
@@ -18947,11 +19380,23 @@
         </w:numPr>
       </w:pPr>
       <w:r>
+        <w:t xml:space="preserve">☒ Challenge flag update through challenge update</w:t>
+      </w:r>
+    </w:p>
+    <w:p>
+      <w:pPr>
+        <w:pStyle w:val="Compact"/>
+        <w:numPr>
+          <w:ilvl w:val="0"/>
+          <w:numId w:val="1016"/>
+        </w:numPr>
+      </w:pPr>
+      <w:r>
         <w:t xml:space="preserve">☒ Database backup download endpoint</w:t>
       </w:r>
     </w:p>
-    <w:bookmarkEnd w:id="72"/>
-    <w:bookmarkStart w:id="73" w:name="security-1"/>
+    <w:bookmarkEnd w:id="73"/>
+    <w:bookmarkStart w:id="74" w:name="security-1"/>
     <w:p>
       <w:pPr>
         <w:pStyle w:val="Heading3"/>
@@ -19032,8 +19477,20 @@
         <w:t xml:space="preserve">☒ Flag sharing detection alert</w:t>
       </w:r>
     </w:p>
-    <w:bookmarkEnd w:id="73"/>
-    <w:bookmarkStart w:id="74" w:name="deployment-1"/>
+    <w:p>
+      <w:pPr>
+        <w:pStyle w:val="Compact"/>
+        <w:numPr>
+          <w:ilvl w:val="0"/>
+          <w:numId w:val="1017"/>
+        </w:numPr>
+      </w:pPr>
+      <w:r>
+        <w:t xml:space="preserve">☒ Recommended reverse-proxy TLS deployment plus optional built-in HTTPS mode</w:t>
+      </w:r>
+    </w:p>
+    <w:bookmarkEnd w:id="74"/>
+    <w:bookmarkStart w:id="75" w:name="deployment-1"/>
     <w:p>
       <w:pPr>
         <w:pStyle w:val="Heading3"/>
@@ -19105,6 +19562,27 @@
         </w:numPr>
       </w:pPr>
       <w:r>
+        <w:t xml:space="preserve">☒ Optional direct HTTPS serving via Rustls when enabled in</w:t>
+      </w:r>
+      <w:r>
+        <w:t xml:space="preserve"> </w:t>
+      </w:r>
+      <w:r>
+        <w:rPr>
+          <w:rStyle w:val="VerbatimChar"/>
+        </w:rPr>
+        <w:t xml:space="preserve">[server]</w:t>
+      </w:r>
+    </w:p>
+    <w:p>
+      <w:pPr>
+        <w:pStyle w:val="Compact"/>
+        <w:numPr>
+          <w:ilvl w:val="0"/>
+          <w:numId w:val="1018"/>
+        </w:numPr>
+      </w:pPr>
+      <w:r>
         <w:t xml:space="preserve">☒ Release build produces a self-contained binary with embedded frontend and migrations</w:t>
       </w:r>
     </w:p>
@@ -19129,9 +19607,9 @@
         </w:pict>
       </w:r>
     </w:p>
-    <w:bookmarkEnd w:id="74"/>
     <w:bookmarkEnd w:id="75"/>
-    <w:bookmarkStart w:id="76" w:name="out-of-scope-v1"/>
+    <w:bookmarkEnd w:id="76"/>
+    <w:bookmarkStart w:id="77" w:name="out-of-scope-v1"/>
     <w:p>
       <w:pPr>
         <w:pStyle w:val="Heading2"/>
@@ -19227,8 +19705,8 @@
         </w:pict>
       </w:r>
     </w:p>
-    <w:bookmarkEnd w:id="76"/>
-    <w:bookmarkStart w:id="77" w:name="glossary"/>
+    <w:bookmarkEnd w:id="77"/>
+    <w:bookmarkStart w:id="78" w:name="glossary"/>
     <w:p>
       <w:pPr>
         <w:pStyle w:val="Heading2"/>
@@ -19527,8 +20005,8 @@
         <w:t xml:space="preserve">Apache 2.0 License · CyberSquirrels CTF Team</w:t>
       </w:r>
     </w:p>
-    <w:bookmarkEnd w:id="77"/>
     <w:bookmarkEnd w:id="78"/>
+    <w:bookmarkEnd w:id="79"/>
     <w:sectPr/>
   </w:body>
 </w:document>

</xml_diff>